<commit_message>
Expand Viva Crash Course to 35 comprehensive questions and update DOCX
</commit_message>
<xml_diff>
--- a/CineBook_Ultimate_Viva_Crash_Course.docx
+++ b/CineBook_Ultimate_Viva_Crash_Course.docx
@@ -32,17 +32,12 @@
           <w:b/>
           <w:color w:val="800000"/>
         </w:rPr>
-        <w:t>CineBook: Ultimate Viva Crash Course &amp; Grilling Defense</w:t>
+        <w:t>CineBook: Ultimate Viva Crash Course &amp; Grilling Defense (Expanded Edition)</w:t>
       </w:r>
     </w:p>
     <w:p>
       <w:r>
-        <w:t>*Prepared for coursework evaluation and recruiter technical interviews*</w:t>
-      </w:r>
-    </w:p>
-    <w:p>
-      <w:r>
-        <w:t>This guide is written for absolute beginners. If you do not know how to code in JavaScript/React, Java, or Python, read this document. It covers the absolute basics, breaks down code snippets line-by-line, and explains how faculty and recruiters will try to catch you out during your Viva.</w:t>
+        <w:t>*Contains 35 high-probability questions covering Language Basics, Snippet Walkthroughs, and Hard-level Defense scenarios*</w:t>
       </w:r>
     </w:p>
     <w:p>
@@ -59,7 +54,7 @@
           <w:b/>
           <w:color w:val="800000"/>
         </w:rPr>
-        <w:t>PART 1: The Absolute Basics of the Languages</w:t>
+        <w:t>PART 1: The Absolute Basics of the Languages (Q1 - Q10)</w:t>
       </w:r>
     </w:p>
     <w:p>
@@ -71,7 +66,7 @@
           <w:b/>
           <w:color w:val="323232"/>
         </w:rPr>
-        <w:t>1. JavaScript &amp; React (The Frontend)</w:t>
+        <w:t>Q1. What is JavaScript (JS) and how does it differ from HTML/CSS?</w:t>
       </w:r>
     </w:p>
     <w:p>
@@ -85,10 +80,10 @@
         <w:rPr>
           <w:b/>
         </w:rPr>
-        <w:t>What is JavaScript (JS)?</w:t>
+        <w:t>What:</w:t>
       </w:r>
       <w:r>
-        <w:t xml:space="preserve"> JS is the programming language that runs inside the web browser. It makes web pages interactive. If HTML is the skeleton, and CSS is the skin/clothing, JS is the muscle that moves things.</w:t>
+        <w:t xml:space="preserve"> HTML defines the structure of a webpage, CSS defines its layout and styling, and JavaScript adds programmatic logic and interactivity.</w:t>
       </w:r>
     </w:p>
     <w:p>
@@ -102,10 +97,10 @@
         <w:rPr>
           <w:b/>
         </w:rPr>
-        <w:t>What is React?</w:t>
+        <w:t>How:</w:t>
       </w:r>
       <w:r>
-        <w:t xml:space="preserve"> React is a JavaScript library built by Facebook. Instead of loading new pages from scratch, React lets us build a Single Page Application (SPA). The page never reloads; instead, components (like the seat map or the checkout form) update dynamically on the fly.</w:t>
+        <w:t xml:space="preserve"> JavaScript executes in the browser's engine (like Chrome V8) to manipulate the DOM (Document Object Model) dynamically without reloading the page.</w:t>
       </w:r>
     </w:p>
     <w:p>
@@ -119,25 +114,22 @@
         <w:rPr>
           <w:b/>
         </w:rPr>
-        <w:t>Key React Concepts to Know:</w:t>
+        <w:t>Why:</w:t>
       </w:r>
-      <w:r/>
+      <w:r>
+        <w:t xml:space="preserve"> Without JS, the movie booking map, stepper, and password checks would be completely static and non-functional.</w:t>
+      </w:r>
     </w:p>
     <w:p>
       <w:pPr>
-        <w:pStyle w:val="ListBullet"/>
+        <w:pStyle w:val="Heading3"/>
       </w:pPr>
-      <w:r>
-        <w:t xml:space="preserve">  </w:t>
-      </w:r>
       <w:r>
         <w:rPr>
           <w:b/>
+          <w:color w:val="323232"/>
         </w:rPr>
-        <w:t>Components:</w:t>
-      </w:r>
-      <w:r>
-        <w:t xml:space="preserve"> Reusable UI blocks written as JavaScript functions (e.g., `SeatMap()`).</w:t>
+        <w:t>Q2. What is React and why do we use it in CineBook?</w:t>
       </w:r>
     </w:p>
     <w:p>
@@ -151,22 +143,10 @@
         <w:rPr>
           <w:b/>
         </w:rPr>
-        <w:t>State (`useState`):</w:t>
+        <w:t>What:</w:t>
       </w:r>
       <w:r>
-        <w:t xml:space="preserve"> Variables that, when changed, trigger React to instantly re-render that specific part of the web page. For example, if `selectedSeats` state changes from `1` to `2`, the ticket summary updates immediately.</w:t>
-      </w:r>
-    </w:p>
-    <w:p>
-      <w:pPr>
-        <w:pStyle w:val="Heading3"/>
-      </w:pPr>
-      <w:r>
-        <w:rPr>
-          <w:b/>
-          <w:color w:val="323232"/>
-        </w:rPr>
-        <w:t>2. Java (Object-Oriented Programming - OOP)</w:t>
+        <w:t xml:space="preserve"> React is a component-based frontend library built by Facebook.</w:t>
       </w:r>
     </w:p>
     <w:p>
@@ -180,10 +160,10 @@
         <w:rPr>
           <w:b/>
         </w:rPr>
-        <w:t>What is Java?</w:t>
+        <w:t>How:</w:t>
       </w:r>
       <w:r>
-        <w:t xml:space="preserve"> A class-based, strongly-typed programming language. It is compiled into bytecode that runs on any machine with a Java Virtual Machine (JVM).</w:t>
+        <w:t xml:space="preserve"> It uses a Virtual DOM to compute changes efficiently and update only the modified nodes of the webpage.</w:t>
       </w:r>
     </w:p>
     <w:p>
@@ -197,25 +177,22 @@
         <w:rPr>
           <w:b/>
         </w:rPr>
-        <w:t>Core OOP Concepts to Explain:</w:t>
+        <w:t>Why:</w:t>
       </w:r>
-      <w:r/>
+      <w:r>
+        <w:t xml:space="preserve"> It enables building CineBook as a Single Page Application (SPA), providing smooth transitions and keeping state (like booking details) consistent across pages.</w:t>
+      </w:r>
     </w:p>
     <w:p>
       <w:pPr>
-        <w:pStyle w:val="ListBullet"/>
+        <w:pStyle w:val="Heading3"/>
       </w:pPr>
-      <w:r>
-        <w:t xml:space="preserve">  </w:t>
-      </w:r>
       <w:r>
         <w:rPr>
           <w:b/>
+          <w:color w:val="323232"/>
         </w:rPr>
-        <w:t>Class vs Object:</w:t>
-      </w:r>
-      <w:r>
-        <w:t xml:space="preserve"> A *Class* is a blueprint (e.g., the `Card` template). An *Object* is the physical instance created from that blueprint (e.g., `Visa Card with digits 4242...`).</w:t>
+        <w:t>Q3. What is the difference between `state` and `props` in React?</w:t>
       </w:r>
     </w:p>
     <w:p>
@@ -229,10 +206,10 @@
         <w:rPr>
           <w:b/>
         </w:rPr>
-        <w:t>Encapsulation:</w:t>
+        <w:t>State:</w:t>
       </w:r>
       <w:r>
-        <w:t xml:space="preserve"> Keeping attributes private (`private String cardNumber`) so that they cannot be modified directly from outside the class. Access is granted only via public methods (Getters/Setters).</w:t>
+        <w:t xml:space="preserve"> A local data store managed *inside* the component itself (e.g., whether a specific seat is clicked). It is mutable.</w:t>
       </w:r>
     </w:p>
     <w:p>
@@ -246,10 +223,22 @@
         <w:rPr>
           <w:b/>
         </w:rPr>
-        <w:t>Inheritance:</w:t>
+        <w:t>Props:</w:t>
       </w:r>
       <w:r>
-        <w:t xml:space="preserve"> Creating a child class that inherits properties from a parent class.</w:t>
+        <w:t xml:space="preserve"> Configuration parameters passed down from a *parent* component to a *child* component (e.g., passing a movie ID to a card component). It is read-only.</w:t>
+      </w:r>
+    </w:p>
+    <w:p>
+      <w:pPr>
+        <w:pStyle w:val="Heading3"/>
+      </w:pPr>
+      <w:r>
+        <w:rPr>
+          <w:b/>
+          <w:color w:val="323232"/>
+        </w:rPr>
+        <w:t>Q4. What is a Class in Java and how does it relate to an Object?</w:t>
       </w:r>
     </w:p>
     <w:p>
@@ -263,22 +252,10 @@
         <w:rPr>
           <w:b/>
         </w:rPr>
-        <w:t>Polymorphism:</w:t>
+        <w:t>What:</w:t>
       </w:r>
       <w:r>
-        <w:t xml:space="preserve"> Overriding inherited methods to do different things. For example, `WeakPolicy` and `StrongPolicy` both inherit from `PasswordPolicy`, but they validate passwords differently.</w:t>
-      </w:r>
-    </w:p>
-    <w:p>
-      <w:pPr>
-        <w:pStyle w:val="Heading3"/>
-      </w:pPr>
-      <w:r>
-        <w:rPr>
-          <w:b/>
-          <w:color w:val="323232"/>
-        </w:rPr>
-        <w:t>3. Python (Scripting &amp; Data Analysis)</w:t>
+        <w:t xml:space="preserve"> A class is a logical blueprint that defines attributes and methods. An object is a physical instance of that class allocated in memory.</w:t>
       </w:r>
     </w:p>
     <w:p>
@@ -292,10 +269,10 @@
         <w:rPr>
           <w:b/>
         </w:rPr>
-        <w:t>What is Python?</w:t>
+        <w:t>How:</w:t>
       </w:r>
       <w:r>
-        <w:t xml:space="preserve"> A highly readable, dynamic language widely used for security scripting, data analysis, and automation.</w:t>
+        <w:t xml:space="preserve"> We instantiate objects using the `new` keyword (e.g., `Card myCard = new Card()`).</w:t>
       </w:r>
     </w:p>
     <w:p>
@@ -309,25 +286,90 @@
         <w:rPr>
           <w:b/>
         </w:rPr>
-        <w:t>Key Python Concepts to Know:</w:t>
+        <w:t>Why:</w:t>
       </w:r>
-      <w:r/>
+      <w:r>
+        <w:t xml:space="preserve"> It allows us to bundle data and behaviors together (like card details and Luhn validation logic).</w:t>
+      </w:r>
     </w:p>
     <w:p>
       <w:pPr>
-        <w:pStyle w:val="ListBullet"/>
+        <w:pStyle w:val="Heading3"/>
       </w:pPr>
       <w:r>
-        <w:t xml:space="preserve">  </w:t>
+        <w:rPr>
+          <w:b/>
+          <w:color w:val="323232"/>
+        </w:rPr>
+        <w:t>Q5. What are the four pillars of Object-Oriented Programming (OOP)?</w:t>
+      </w:r>
+    </w:p>
+    <w:p>
+      <w:r>
+        <w:t xml:space="preserve">1.  </w:t>
       </w:r>
       <w:r>
         <w:rPr>
           <w:b/>
         </w:rPr>
-        <w:t>Abstract Base Class (ABC):</w:t>
+        <w:t>Encapsulation:</w:t>
       </w:r>
       <w:r>
-        <w:t xml:space="preserve"> A parent class that cannot be instantiated directly. It acts as a strict template forcing child classes to implement specific methods.</w:t>
+        <w:t xml:space="preserve"> Hiding internal state details (using `private` fields and getters/setters).</w:t>
+      </w:r>
+    </w:p>
+    <w:p>
+      <w:r>
+        <w:t xml:space="preserve">2.  </w:t>
+      </w:r>
+      <w:r>
+        <w:rPr>
+          <w:b/>
+        </w:rPr>
+        <w:t>Inheritance:</w:t>
+      </w:r>
+      <w:r>
+        <w:t xml:space="preserve"> Reusing code by allowing a child class to inherit fields and methods from a parent class.</w:t>
+      </w:r>
+    </w:p>
+    <w:p>
+      <w:r>
+        <w:t xml:space="preserve">3.  </w:t>
+      </w:r>
+      <w:r>
+        <w:rPr>
+          <w:b/>
+        </w:rPr>
+        <w:t>Polymorphism:</w:t>
+      </w:r>
+      <w:r>
+        <w:t xml:space="preserve"> The ability of different classes to respond to the same method call in different ways.</w:t>
+      </w:r>
+    </w:p>
+    <w:p>
+      <w:r>
+        <w:t xml:space="preserve">4.  </w:t>
+      </w:r>
+      <w:r>
+        <w:rPr>
+          <w:b/>
+        </w:rPr>
+        <w:t>Abstraction:</w:t>
+      </w:r>
+      <w:r>
+        <w:t xml:space="preserve"> Hiding complex implementation details and showing only the essential features (using abstract classes/interfaces).</w:t>
+      </w:r>
+    </w:p>
+    <w:p>
+      <w:pPr>
+        <w:pStyle w:val="Heading3"/>
+      </w:pPr>
+      <w:r>
+        <w:rPr>
+          <w:b/>
+          <w:color w:val="323232"/>
+        </w:rPr>
+        <w:t>Q6. What is method overriding (Runtime Polymorphism) in Java?</w:t>
       </w:r>
     </w:p>
     <w:p>
@@ -341,10 +383,262 @@
         <w:rPr>
           <w:b/>
         </w:rPr>
-        <w:t>Matplotlib:</w:t>
+        <w:t>What:</w:t>
       </w:r>
       <w:r>
-        <w:t xml:space="preserve"> A plotting library in Python used to draw graphs and charts.</w:t>
+        <w:t xml:space="preserve"> When a subclass provides a specific implementation of a method that is already defined in its parent class.</w:t>
+      </w:r>
+    </w:p>
+    <w:p>
+      <w:pPr>
+        <w:pStyle w:val="ListBullet"/>
+      </w:pPr>
+      <w:r>
+        <w:t xml:space="preserve">  </w:t>
+      </w:r>
+      <w:r>
+        <w:rPr>
+          <w:b/>
+        </w:rPr>
+        <w:t>How:</w:t>
+      </w:r>
+      <w:r>
+        <w:t xml:space="preserve"> We use the same method signature in the child class (using the `@Override` annotation).</w:t>
+      </w:r>
+    </w:p>
+    <w:p>
+      <w:pPr>
+        <w:pStyle w:val="ListBullet"/>
+      </w:pPr>
+      <w:r>
+        <w:t xml:space="preserve">  </w:t>
+      </w:r>
+      <w:r>
+        <w:rPr>
+          <w:b/>
+        </w:rPr>
+        <w:t>Why:</w:t>
+      </w:r>
+      <w:r>
+        <w:t xml:space="preserve"> In our project, `WeakPolicy` and `StrongPolicy` both override the `validate()` method of `PasswordPolicy` to enforce different security criteria.</w:t>
+      </w:r>
+    </w:p>
+    <w:p>
+      <w:pPr>
+        <w:pStyle w:val="Heading3"/>
+      </w:pPr>
+      <w:r>
+        <w:rPr>
+          <w:b/>
+          <w:color w:val="323232"/>
+        </w:rPr>
+        <w:t>Q7. What is an Abstract Base Class (ABC) in Python?</w:t>
+      </w:r>
+    </w:p>
+    <w:p>
+      <w:pPr>
+        <w:pStyle w:val="ListBullet"/>
+      </w:pPr>
+      <w:r>
+        <w:t xml:space="preserve">  </w:t>
+      </w:r>
+      <w:r>
+        <w:rPr>
+          <w:b/>
+        </w:rPr>
+        <w:t>What:</w:t>
+      </w:r>
+      <w:r>
+        <w:t xml:space="preserve"> A class that cannot be directly instantiated and defines abstract methods that its subclasses *must* implement.</w:t>
+      </w:r>
+    </w:p>
+    <w:p>
+      <w:pPr>
+        <w:pStyle w:val="ListBullet"/>
+      </w:pPr>
+      <w:r>
+        <w:t xml:space="preserve">  </w:t>
+      </w:r>
+      <w:r>
+        <w:rPr>
+          <w:b/>
+        </w:rPr>
+        <w:t>How:</w:t>
+      </w:r>
+      <w:r>
+        <w:t xml:space="preserve"> Inheriting from `abc.ABC` and using the `@abstractmethod` decorator.</w:t>
+      </w:r>
+    </w:p>
+    <w:p>
+      <w:pPr>
+        <w:pStyle w:val="ListBullet"/>
+      </w:pPr>
+      <w:r>
+        <w:t xml:space="preserve">  </w:t>
+      </w:r>
+      <w:r>
+        <w:rPr>
+          <w:b/>
+        </w:rPr>
+        <w:t>Why:</w:t>
+      </w:r>
+      <w:r>
+        <w:t xml:space="preserve"> It enforces a contract on all validation classes in the Python auditor, ensuring they all implement a `perform_check()` method.</w:t>
+      </w:r>
+    </w:p>
+    <w:p>
+      <w:pPr>
+        <w:pStyle w:val="Heading3"/>
+      </w:pPr>
+      <w:r>
+        <w:rPr>
+          <w:b/>
+          <w:color w:val="323232"/>
+        </w:rPr>
+        <w:t>Q8. What is the difference between a List and a Set in Java?</w:t>
+      </w:r>
+    </w:p>
+    <w:p>
+      <w:pPr>
+        <w:pStyle w:val="ListBullet"/>
+      </w:pPr>
+      <w:r>
+        <w:t xml:space="preserve">  </w:t>
+      </w:r>
+      <w:r>
+        <w:rPr>
+          <w:b/>
+        </w:rPr>
+        <w:t>List:</w:t>
+      </w:r>
+      <w:r>
+        <w:t xml:space="preserve"> An ordered collection that allows duplicate elements (e.g., `ArrayList`). We use it to store all saved credit cards in order.</w:t>
+      </w:r>
+    </w:p>
+    <w:p>
+      <w:pPr>
+        <w:pStyle w:val="ListBullet"/>
+      </w:pPr>
+      <w:r>
+        <w:t xml:space="preserve">  </w:t>
+      </w:r>
+      <w:r>
+        <w:rPr>
+          <w:b/>
+        </w:rPr>
+        <w:t>Set:</w:t>
+      </w:r>
+      <w:r>
+        <w:t xml:space="preserve"> An unordered collection that does not allow duplicate elements (e.g., `HashSet`). We use it to collect unique character types in our password analyzer.</w:t>
+      </w:r>
+    </w:p>
+    <w:p>
+      <w:pPr>
+        <w:pStyle w:val="Heading3"/>
+      </w:pPr>
+      <w:r>
+        <w:rPr>
+          <w:b/>
+          <w:color w:val="323232"/>
+        </w:rPr>
+        <w:t>Q9. What is a dictionary (dict) in Python?</w:t>
+      </w:r>
+    </w:p>
+    <w:p>
+      <w:pPr>
+        <w:pStyle w:val="ListBullet"/>
+      </w:pPr>
+      <w:r>
+        <w:t xml:space="preserve">  </w:t>
+      </w:r>
+      <w:r>
+        <w:rPr>
+          <w:b/>
+        </w:rPr>
+        <w:t>What:</w:t>
+      </w:r>
+      <w:r>
+        <w:t xml:space="preserve"> An unordered collection of key-value pairs.</w:t>
+      </w:r>
+    </w:p>
+    <w:p>
+      <w:pPr>
+        <w:pStyle w:val="ListBullet"/>
+      </w:pPr>
+      <w:r>
+        <w:t xml:space="preserve">  </w:t>
+      </w:r>
+      <w:r>
+        <w:rPr>
+          <w:b/>
+        </w:rPr>
+        <w:t>How:</w:t>
+      </w:r>
+      <w:r>
+        <w:t xml:space="preserve"> Elements are accessed using keys (e.g., `stats['weak'] = 3`).</w:t>
+      </w:r>
+    </w:p>
+    <w:p>
+      <w:pPr>
+        <w:pStyle w:val="ListBullet"/>
+      </w:pPr>
+      <w:r>
+        <w:t xml:space="preserve">  </w:t>
+      </w:r>
+      <w:r>
+        <w:rPr>
+          <w:b/>
+        </w:rPr>
+        <w:t>Why:</w:t>
+      </w:r>
+      <w:r>
+        <w:t xml:space="preserve"> We use dicts to aggregate audit metrics and map checking rules dynamically.</w:t>
+      </w:r>
+    </w:p>
+    <w:p>
+      <w:pPr>
+        <w:pStyle w:val="Heading3"/>
+      </w:pPr>
+      <w:r>
+        <w:rPr>
+          <w:b/>
+          <w:color w:val="323232"/>
+        </w:rPr>
+        <w:t>Q10. What is the role of the Java Virtual Machine (JVM)?</w:t>
+      </w:r>
+    </w:p>
+    <w:p>
+      <w:pPr>
+        <w:pStyle w:val="ListBullet"/>
+      </w:pPr>
+      <w:r>
+        <w:t xml:space="preserve">  </w:t>
+      </w:r>
+      <w:r>
+        <w:rPr>
+          <w:b/>
+        </w:rPr>
+        <w:t>What:</w:t>
+      </w:r>
+      <w:r>
+        <w:t xml:space="preserve"> The engine that drives Java code execution. It compiles Java source code (.java) into bytecode (.class), which is then interpreted or compiled (JIT) into machine code for the host OS.</w:t>
+      </w:r>
+    </w:p>
+    <w:p>
+      <w:pPr>
+        <w:pStyle w:val="ListBullet"/>
+      </w:pPr>
+      <w:r>
+        <w:t xml:space="preserve">  </w:t>
+      </w:r>
+      <w:r>
+        <w:rPr>
+          <w:b/>
+        </w:rPr>
+        <w:t>Why:</w:t>
+      </w:r>
+      <w:r>
+        <w:t xml:space="preserve"> It guarantees the write-once, run-anywhere capability of the Java payment classes.</w:t>
       </w:r>
     </w:p>
     <w:p>
@@ -361,7 +655,7 @@
           <w:b/>
           <w:color w:val="800000"/>
         </w:rPr>
-        <w:t>PART 2: Line-by-Line Code Walkthroughs</w:t>
+        <w:t>PART 2: Snippet Walkthroughs &amp; Layout Logic (Q11 - Q20)</w:t>
       </w:r>
     </w:p>
     <w:p>
@@ -373,48 +667,7 @@
           <w:b/>
           <w:color w:val="323232"/>
         </w:rPr>
-        <w:t>Snippet 1: Luhn's Algorithm Card Validation (JavaScript/Vue)</w:t>
-      </w:r>
-    </w:p>
-    <w:p>
-      <w:r>
-        <w:t>Located in [CardForm.js](file:///D:/PROJECTS/WEB-DEV-VOC/NEWFINAL/src/pages/CardForm.js) &amp; [cardManager.js](file:///D:/PROJECTS/WEB-DEV-VOC/NEWFINAL/src/security/cardManager.js):</w:t>
-      </w:r>
-    </w:p>
-    <w:p>
-      <w:pPr>
-        <w:spacing w:before="80" w:after="80"/>
-        <w:ind w:left="400"/>
-      </w:pPr>
-      <w:r>
-        <w:rPr>
-          <w:rFonts w:ascii="Consolas" w:hAnsi="Consolas"/>
-          <w:color w:val="323232"/>
-          <w:sz w:val="17"/>
-        </w:rPr>
-        <w:t>var sum = 0;</w:t>
-        <w:br/>
-        <w:t>var shouldDouble = false;</w:t>
-        <w:br/>
-        <w:t>for (var i = num.length - 1; i &gt;= 0; i--) {</w:t>
-        <w:br/>
-        <w:t xml:space="preserve">  var digit = parseInt(num.charAt(i));</w:t>
-        <w:br/>
-        <w:t xml:space="preserve">  if (shouldDouble) {</w:t>
-        <w:br/>
-        <w:t xml:space="preserve">    digit *= 2;</w:t>
-        <w:br/>
-        <w:t xml:space="preserve">    if (digit &gt; 9) digit -= 9;</w:t>
-        <w:br/>
-        <w:t xml:space="preserve">  }</w:t>
-        <w:br/>
-        <w:t xml:space="preserve">  sum += digit;</w:t>
-        <w:br/>
-        <w:t xml:space="preserve">  shouldDouble = !shouldDouble;</w:t>
-        <w:br/>
-        <w:t>}</w:t>
-        <w:br/>
-        <w:t>return sum % 10 === 0;</w:t>
+        <w:t>Q11. Walk through the Luhn's check math sequence.</w:t>
       </w:r>
     </w:p>
     <w:p>
@@ -428,53 +681,42 @@
         <w:rPr>
           <w:b/>
         </w:rPr>
-        <w:t>Line-by-Line Explanation:</w:t>
+        <w:t>Math:</w:t>
       </w:r>
-      <w:r/>
-    </w:p>
-    <w:p>
       <w:r>
-        <w:t>1.  `var sum = 0;`: Initializes a counter to store the running sum.</w:t>
+        <w:t xml:space="preserve"> Take `4242-4242-4242-4242`. Starting from the right:</w:t>
       </w:r>
     </w:p>
     <w:p>
+      <w:pPr>
+        <w:pStyle w:val="ListBullet"/>
+      </w:pPr>
       <w:r>
-        <w:t>2.  `var shouldDouble = false;`: A flag that tracks whether to double the current digit. We double every other digit starting from the right.</w:t>
+        <w:t xml:space="preserve">  Digits at odd positions remain the same: `2, 2, 2, 2, 2, 2, 2, 2` (sum = 16).</w:t>
       </w:r>
     </w:p>
     <w:p>
+      <w:pPr>
+        <w:pStyle w:val="ListBullet"/>
+      </w:pPr>
       <w:r>
-        <w:t>3.  `for (var i = num.length - 1; i &gt;= 0; i--)`: Loops through the card number characters from right to left.</w:t>
+        <w:t xml:space="preserve">  Digits at even positions are doubled: `4*2=8`. Since all are 8: `8, 8, 8, 8, 8, 8, 8, 8` (sum = 64).</w:t>
       </w:r>
     </w:p>
     <w:p>
+      <w:pPr>
+        <w:pStyle w:val="ListBullet"/>
+      </w:pPr>
       <w:r>
-        <w:t>4.  `var digit = parseInt(num.charAt(i))`: Converts the single string character into an integer number.</w:t>
+        <w:t xml:space="preserve">  Total sum = `16 + 64 = 80`.</w:t>
       </w:r>
     </w:p>
     <w:p>
+      <w:pPr>
+        <w:pStyle w:val="ListBullet"/>
+      </w:pPr>
       <w:r>
-        <w:t>5.  `if (shouldDouble) { ... }`: If the flag is true, double the digit. If doubling results in a number greater than 9 (e.g. `8 * 2 = 16`), subtract 9 (`16 - 9 = 7`).</w:t>
-      </w:r>
-    </w:p>
-    <w:p>
-      <w:r>
-        <w:t>6.  `sum += digit;`: Adds the digit to our running sum.</w:t>
-      </w:r>
-    </w:p>
-    <w:p>
-      <w:r>
-        <w:t>7.  `shouldDouble = !shouldDouble;`: Inverts the flag so the next digit is not doubled, but the one after is.</w:t>
-      </w:r>
-    </w:p>
-    <w:p>
-      <w:r>
-        <w:t>8.  `return sum % 10 === 0;`: If the final sum is divisible by 10, the card number is valid and we return `true`.</w:t>
-      </w:r>
-    </w:p>
-    <w:p>
-      <w:r>
-        <w:t>---</w:t>
+        <w:t xml:space="preserve">  `80 % 10 == 0`, meaning it passes Luhn verification.</w:t>
       </w:r>
     </w:p>
     <w:p>
@@ -486,52 +728,7 @@
           <w:b/>
           <w:color w:val="323232"/>
         </w:rPr>
-        <w:t>Snippet 2: Concurrency &amp; Mutex Seating Hold (Java)</w:t>
-      </w:r>
-    </w:p>
-    <w:p>
-      <w:r>
-        <w:t>Located in [BookingPage.js](file:///D:/PROJECTS/WEB-DEV-VOC/NEWFINAL/src/pages/BookingPage.js):</w:t>
-      </w:r>
-    </w:p>
-    <w:p>
-      <w:pPr>
-        <w:spacing w:before="80" w:after="80"/>
-        <w:ind w:left="400"/>
-      </w:pPr>
-      <w:r>
-        <w:rPr>
-          <w:rFonts w:ascii="Consolas" w:hAnsi="Consolas"/>
-          <w:color w:val="323232"/>
-          <w:sz w:val="17"/>
-        </w:rPr>
-        <w:t>// Simulated Java Thread Locks</w:t>
-        <w:br/>
-        <w:t>public class MutexLock implements Runnable {</w:t>
-        <w:br/>
-        <w:t xml:space="preserve">    private boolean isLocked = false;</w:t>
-        <w:br/>
-        <w:t xml:space="preserve">    public synchronized void acquire() throws InterruptedException {</w:t>
-        <w:br/>
-        <w:t xml:space="preserve">        while (isLocked) {</w:t>
-        <w:br/>
-        <w:t xml:space="preserve">            wait();</w:t>
-        <w:br/>
-        <w:t xml:space="preserve">        }</w:t>
-        <w:br/>
-        <w:t xml:space="preserve">        isLocked = true;</w:t>
-        <w:br/>
-        <w:t xml:space="preserve">    }</w:t>
-        <w:br/>
-        <w:t xml:space="preserve">    public synchronized void release() {</w:t>
-        <w:br/>
-        <w:t xml:space="preserve">        isLocked = false;</w:t>
-        <w:br/>
-        <w:t xml:space="preserve">        notify();</w:t>
-        <w:br/>
-        <w:t xml:space="preserve">    }</w:t>
-        <w:br/>
-        <w:t>}</w:t>
+        <w:t>Q12. Explain the React-Vue bridge initialization script.</w:t>
       </w:r>
     </w:p>
     <w:p>
@@ -545,90 +742,10 @@
         <w:rPr>
           <w:b/>
         </w:rPr>
-        <w:t>Line-by-Line Explanation:</w:t>
+        <w:t>How:</w:t>
       </w:r>
-      <w:r/>
-    </w:p>
-    <w:p>
       <w:r>
-        <w:t>1.  `public class MutexLock implements Runnable`: Declares a class representing a mutual exclusion lock that can run on a concurrent thread.</w:t>
-      </w:r>
-    </w:p>
-    <w:p>
-      <w:r>
-        <w:t>2.  `private boolean isLocked = false;`: A state variable tracking if a seat row is currently reserved.</w:t>
-      </w:r>
-    </w:p>
-    <w:p>
-      <w:r>
-        <w:t>3.  `public synchronized void acquire()`: The `synchronized` keyword ensures only one thread can execute this method at a time.</w:t>
-      </w:r>
-    </w:p>
-    <w:p>
-      <w:r>
-        <w:t>4.  `while (isLocked) { wait(); }`: If another user has already locked the seats, the thread waits in queue.</w:t>
-      </w:r>
-    </w:p>
-    <w:p>
-      <w:r>
-        <w:t>5.  `isLocked = true;`: Sets the lock status to true, blocking other users.</w:t>
-      </w:r>
-    </w:p>
-    <w:p>
-      <w:r>
-        <w:t>6.  `public synchronized void release()`: Releases the lock, changing `isLocked` to false and calling `notify()` to wake up any waiting threads.</w:t>
-      </w:r>
-    </w:p>
-    <w:p>
-      <w:r>
-        <w:t>---</w:t>
-      </w:r>
-    </w:p>
-    <w:p>
-      <w:pPr>
-        <w:pStyle w:val="Heading3"/>
-      </w:pPr>
-      <w:r>
-        <w:rPr>
-          <w:b/>
-          <w:color w:val="323232"/>
-        </w:rPr>
-        <w:t>Snippet 3: Python Abstract Base Class (Python)</w:t>
-      </w:r>
-    </w:p>
-    <w:p>
-      <w:r>
-        <w:t>Located in [password_audit.py](file:///D:/PROJECTS/WEB-DEV-VOC/NEWFINAL/python/password_audit.py):</w:t>
-      </w:r>
-    </w:p>
-    <w:p>
-      <w:pPr>
-        <w:spacing w:before="80" w:after="80"/>
-        <w:ind w:left="400"/>
-      </w:pPr>
-      <w:r>
-        <w:rPr>
-          <w:rFonts w:ascii="Consolas" w:hAnsi="Consolas"/>
-          <w:color w:val="323232"/>
-          <w:sz w:val="17"/>
-        </w:rPr>
-        <w:t>from abc import ABC, abstractmethod</w:t>
-        <w:br/>
-        <w:br/>
-        <w:t>class PasswordCheck(ABC):</w:t>
-        <w:br/>
-        <w:t xml:space="preserve">    @abstractmethod</w:t>
-        <w:br/>
-        <w:t xml:space="preserve">    def perform_check(self, password):</w:t>
-        <w:br/>
-        <w:t xml:space="preserve">        pass</w:t>
-        <w:br/>
-        <w:br/>
-        <w:t>class LengthCheck(PasswordCheck):</w:t>
-        <w:br/>
-        <w:t xml:space="preserve">    def perform_check(self, password):</w:t>
-        <w:br/>
-        <w:t xml:space="preserve">        return len(password) &gt;= 8</w:t>
+        <w:t xml:space="preserve"> In `index.html`, we check `window.location.hash`. If it matches `#/card-form`, we run `new Vue({ el: '#vue-card-form-root' })`.</w:t>
       </w:r>
     </w:p>
     <w:p>
@@ -642,38 +759,320 @@
         <w:rPr>
           <w:b/>
         </w:rPr>
-        <w:t>Line-by-Line Explanation:</w:t>
+        <w:t>Why:</w:t>
+      </w:r>
+      <w:r>
+        <w:t xml:space="preserve"> React runs the main layout. When navigating to the Java Checker or Card Form, React renders an empty container div, and our router immediately bootstraps a Vue instance on that container.</w:t>
+      </w:r>
+    </w:p>
+    <w:p>
+      <w:pPr>
+        <w:pStyle w:val="Heading3"/>
+      </w:pPr>
+      <w:r>
+        <w:rPr>
+          <w:b/>
+          <w:color w:val="323232"/>
+        </w:rPr>
+        <w:t>Q13. How does the 3D ticket card tilt transform mathematically?</w:t>
+      </w:r>
+    </w:p>
+    <w:p>
+      <w:pPr>
+        <w:pStyle w:val="ListBullet"/>
+      </w:pPr>
+      <w:r>
+        <w:t xml:space="preserve">  </w:t>
+      </w:r>
+      <w:r>
+        <w:rPr>
+          <w:b/>
+        </w:rPr>
+        <w:t>How:</w:t>
+      </w:r>
+      <w:r>
+        <w:t xml:space="preserve"> On mousemove, we get the mouse position `clientX, clientY` and subtract the element's bounding rect offsets `left, top` and its half-width/half-height to find the center offset `(x, y)`.</w:t>
+      </w:r>
+    </w:p>
+    <w:p>
+      <w:pPr>
+        <w:pStyle w:val="ListBullet"/>
+      </w:pPr>
+      <w:r>
+        <w:t xml:space="preserve">  </w:t>
+      </w:r>
+      <w:r>
+        <w:rPr>
+          <w:b/>
+        </w:rPr>
+        <w:t>Rotation:</w:t>
+      </w:r>
+      <w:r>
+        <w:t xml:space="preserve"> We calculate degrees: `rotateX = -y * factor` and `rotateY = x * factor`, applying it as `transform: perspective(1000px) rotateX(...) rotateY(...)`.</w:t>
+      </w:r>
+    </w:p>
+    <w:p>
+      <w:pPr>
+        <w:pStyle w:val="Heading3"/>
+      </w:pPr>
+      <w:r>
+        <w:rPr>
+          <w:b/>
+          <w:color w:val="323232"/>
+        </w:rPr>
+        <w:t>Q14. Walk through the Seat Map best seats recommendation search.</w:t>
+      </w:r>
+    </w:p>
+    <w:p>
+      <w:pPr>
+        <w:pStyle w:val="ListBullet"/>
+      </w:pPr>
+      <w:r>
+        <w:t xml:space="preserve">  </w:t>
+      </w:r>
+      <w:r>
+        <w:rPr>
+          <w:b/>
+        </w:rPr>
+        <w:t>How:</w:t>
+      </w:r>
+      <w:r>
+        <w:t xml:space="preserve"> It iterates from the center rows (e.g., Row E, D) to the edges, picking adjacent empty seats in the premium tier first, then classic tiers.</w:t>
+      </w:r>
+    </w:p>
+    <w:p>
+      <w:pPr>
+        <w:pStyle w:val="ListBullet"/>
+      </w:pPr>
+      <w:r>
+        <w:t xml:space="preserve">  </w:t>
+      </w:r>
+      <w:r>
+        <w:rPr>
+          <w:b/>
+        </w:rPr>
+        <w:t>Why:</w:t>
+      </w:r>
+      <w:r>
+        <w:t xml:space="preserve"> Matches real-world theater logic where users want centralized views.</w:t>
+      </w:r>
+    </w:p>
+    <w:p>
+      <w:pPr>
+        <w:pStyle w:val="Heading3"/>
+      </w:pPr>
+      <w:r>
+        <w:rPr>
+          <w:b/>
+          <w:color w:val="323232"/>
+        </w:rPr>
+        <w:t>Q15. Walk through the BufferedWriter serialization code.</w:t>
+      </w:r>
+    </w:p>
+    <w:p>
+      <w:pPr>
+        <w:pStyle w:val="ListBullet"/>
+      </w:pPr>
+      <w:r>
+        <w:t xml:space="preserve">  </w:t>
+      </w:r>
+      <w:r>
+        <w:rPr>
+          <w:b/>
+        </w:rPr>
+        <w:t>How:</w:t>
       </w:r>
       <w:r/>
     </w:p>
     <w:p>
+      <w:pPr>
+        <w:spacing w:before="80" w:after="80"/>
+        <w:ind w:left="400"/>
+      </w:pPr>
       <w:r>
-        <w:t>1.  `from abc import ABC, abstractmethod`: Imports Python's Abstract Base Class modules.</w:t>
+        <w:rPr>
+          <w:rFonts w:ascii="Consolas" w:hAnsi="Consolas"/>
+          <w:color w:val="323232"/>
+          <w:sz w:val="17"/>
+        </w:rPr>
+        <w:t xml:space="preserve">    BufferedWriter writer = new BufferedWriter(new FileWriter("cards.dat", true));</w:t>
+        <w:br/>
+        <w:t xml:space="preserve">    writer.write(card.toString());</w:t>
+        <w:br/>
+        <w:t xml:space="preserve">    writer.newLine();</w:t>
+        <w:br/>
+        <w:t xml:space="preserve">    writer.close();</w:t>
+      </w:r>
+    </w:p>
+    <w:p>
+      <w:pPr>
+        <w:pStyle w:val="ListBullet"/>
+      </w:pPr>
+      <w:r>
+        <w:t xml:space="preserve">  `FileWriter` opens the file in append mode (`true`).</w:t>
+      </w:r>
+    </w:p>
+    <w:p>
+      <w:pPr>
+        <w:pStyle w:val="ListBullet"/>
+      </w:pPr>
+      <w:r>
+        <w:t xml:space="preserve">  `BufferedWriter` wraps it to queue characters in memory before writing to disk, reducing disk accesses.</w:t>
+      </w:r>
+    </w:p>
+    <w:p>
+      <w:pPr>
+        <w:pStyle w:val="Heading3"/>
+      </w:pPr>
+      <w:r>
+        <w:rPr>
+          <w:b/>
+          <w:color w:val="323232"/>
+        </w:rPr>
+        <w:t>Q16. How does the Python Shell Console execute custom string commands?</w:t>
+      </w:r>
+    </w:p>
+    <w:p>
+      <w:pPr>
+        <w:pStyle w:val="ListBullet"/>
+      </w:pPr>
+      <w:r>
+        <w:t xml:space="preserve">  </w:t>
+      </w:r>
+      <w:r>
+        <w:rPr>
+          <w:b/>
+        </w:rPr>
+        <w:t>How:</w:t>
+      </w:r>
+      <w:r>
+        <w:t xml:space="preserve"> It listens to input, splits the string into arguments (e.g. `audit weak`), and calls corresponding JS methods matching the Python script audits.</w:t>
+      </w:r>
+    </w:p>
+    <w:p>
+      <w:pPr>
+        <w:pStyle w:val="Heading3"/>
+      </w:pPr>
+      <w:r>
+        <w:rPr>
+          <w:b/>
+          <w:color w:val="323232"/>
+        </w:rPr>
+        <w:t>Q17. Walk through the SVG QR Code scanner simulation.</w:t>
+      </w:r>
+    </w:p>
+    <w:p>
+      <w:pPr>
+        <w:pStyle w:val="ListBullet"/>
+      </w:pPr>
+      <w:r>
+        <w:t xml:space="preserve">  </w:t>
+      </w:r>
+      <w:r>
+        <w:rPr>
+          <w:b/>
+        </w:rPr>
+        <w:t>How:</w:t>
+      </w:r>
+      <w:r>
+        <w:t xml:space="preserve"> Clicking the QR code updates the ticket state `verified = true`. This updates the CSS class to `.scanned`, displaying a green checkmark and logging the scanning time.</w:t>
+      </w:r>
+    </w:p>
+    <w:p>
+      <w:pPr>
+        <w:pStyle w:val="Heading3"/>
+      </w:pPr>
+      <w:r>
+        <w:rPr>
+          <w:b/>
+          <w:color w:val="323232"/>
+        </w:rPr>
+        <w:t>Q18. How does the card number formatting input parser work?</w:t>
+      </w:r>
+    </w:p>
+    <w:p>
+      <w:pPr>
+        <w:pStyle w:val="ListBullet"/>
+      </w:pPr>
+      <w:r>
+        <w:t xml:space="preserve">  </w:t>
+      </w:r>
+      <w:r>
+        <w:rPr>
+          <w:b/>
+        </w:rPr>
+        <w:t>How:</w:t>
+      </w:r>
+      <w:r>
+        <w:t xml:space="preserve"> It strips non-digits: `val.replace(/\D/g, '')`. Then it groups them: `val.replace(/(\d{4})(?=\d)/g, '$1 ')`.</w:t>
+      </w:r>
+    </w:p>
+    <w:p>
+      <w:pPr>
+        <w:pStyle w:val="Heading3"/>
+      </w:pPr>
+      <w:r>
+        <w:rPr>
+          <w:b/>
+          <w:color w:val="323232"/>
+        </w:rPr>
+        <w:t>Q19. How does the password policy validator select the active rules dynamically?</w:t>
+      </w:r>
+    </w:p>
+    <w:p>
+      <w:pPr>
+        <w:pStyle w:val="ListBullet"/>
+      </w:pPr>
+      <w:r>
+        <w:t xml:space="preserve">  </w:t>
+      </w:r>
+      <w:r>
+        <w:rPr>
+          <w:b/>
+        </w:rPr>
+        <w:t>How:</w:t>
+      </w:r>
+      <w:r>
+        <w:t xml:space="preserve"> By using a factory pattern. If `activePolicy` matches `'StrongPolicy'`, it instantiates `StrongPolicy` and runs `validate()`.</w:t>
+      </w:r>
+    </w:p>
+    <w:p>
+      <w:pPr>
+        <w:pStyle w:val="Heading3"/>
+      </w:pPr>
+      <w:r>
+        <w:rPr>
+          <w:b/>
+          <w:color w:val="323232"/>
+        </w:rPr>
+        <w:t>Q20. Walk through the Python ComplexityCheck regex.</w:t>
+      </w:r>
+    </w:p>
+    <w:p>
+      <w:pPr>
+        <w:pStyle w:val="ListBullet"/>
+      </w:pPr>
+      <w:r>
+        <w:t xml:space="preserve">  </w:t>
+      </w:r>
+      <w:r>
+        <w:rPr>
+          <w:b/>
+        </w:rPr>
+        <w:t>How:</w:t>
+      </w:r>
+      <w:r>
+        <w:t xml:space="preserve"> It checks if a password contains uppercase, lowercase, numbers, and symbols:</w:t>
       </w:r>
     </w:p>
     <w:p>
       <w:r>
-        <w:t>2.  `class PasswordCheck(ABC)`: Defines the abstract parent class. You cannot create a direct object of this class.</w:t>
+        <w:t>`has_upper = re.search(r"[A-Z]", pwd)`</w:t>
       </w:r>
     </w:p>
     <w:p>
       <w:r>
-        <w:t>3.  `@abstractmethod`: A decorator marking `perform_check` as abstract.</w:t>
-      </w:r>
-    </w:p>
-    <w:p>
-      <w:r>
-        <w:t>4.  `def perform_check(self, password): pass`: Placeholder method. Any child class inheriting from `PasswordCheck` MUST override this method.</w:t>
-      </w:r>
-    </w:p>
-    <w:p>
-      <w:r>
-        <w:t>5.  `class LengthCheck(PasswordCheck)`: Creates a concrete child class inheriting from `PasswordCheck`.</w:t>
-      </w:r>
-    </w:p>
-    <w:p>
-      <w:r>
-        <w:t>6.  `def perform_check(self, password): return len(password) &gt;= 8`: Overrides the parent method, checking if the password length is at least 8 characters.</w:t>
+        <w:t>`has_special = re.search(r"[!@#$%^&amp;*]", pwd)`</w:t>
       </w:r>
     </w:p>
     <w:p>
@@ -690,7 +1089,7 @@
           <w:b/>
           <w:color w:val="800000"/>
         </w:rPr>
-        <w:t>PART 3: Faculty &amp; Recruiter Viva Defense Scenarios</w:t>
+        <w:t>PART 3: Hard-Level / Recruiter Grilling Scenarios (Q21 - Q35)</w:t>
       </w:r>
     </w:p>
     <w:p>
@@ -702,7 +1101,7 @@
           <w:b/>
           <w:color w:val="323232"/>
         </w:rPr>
-        <w:t>🎙️ Scenario A: The Faculty Grilling on Concurrency</w:t>
+        <w:t>Q21. "What is a Race Condition, and how does your seat reservation thread avoid it?"</w:t>
       </w:r>
     </w:p>
     <w:p>
@@ -716,10 +1115,10 @@
         <w:rPr>
           <w:b/>
         </w:rPr>
-        <w:t>Faculty:</w:t>
+        <w:t>Grilling:</w:t>
       </w:r>
       <w:r>
-        <w:t xml:space="preserve"> *"I see you have a Mutex lock running. Why did you use Mutex instead of a simple boolean variable to lock the seat database?"*</w:t>
+        <w:t xml:space="preserve"> If two users click a seat at the same time, what happens?</w:t>
       </w:r>
     </w:p>
     <w:p>
@@ -733,10 +1132,22 @@
         <w:rPr>
           <w:b/>
         </w:rPr>
-        <w:t>Your Answer:</w:t>
+        <w:t>Answer:</w:t>
       </w:r>
       <w:r>
-        <w:t xml:space="preserve"> *"A simple boolean variable is not thread-safe. If two threads (representing two different users) check the boolean at the exact same millisecond, both will see 'false' and both will reserve the seat, causing a double-booking. A Mutex uses Java's synchronized locks to force thread safety. Only one thread can check and write at a time, avoiding race conditions."*</w:t>
+        <w:t xml:space="preserve"> *"A race condition occurs when multiple threads read and modify shared data concurrently. In our app, we simulate a synchronized Mutex. Only the thread holding the lock can modify the seat status. Other threads are blocked (`wait()`) until the lock is released."*</w:t>
+      </w:r>
+    </w:p>
+    <w:p>
+      <w:pPr>
+        <w:pStyle w:val="Heading3"/>
+      </w:pPr>
+      <w:r>
+        <w:rPr>
+          <w:b/>
+          <w:color w:val="323232"/>
+        </w:rPr>
+        <w:t>Q22. "What is a Deadlock and how can it occur in a seating lock scenario?"</w:t>
       </w:r>
     </w:p>
     <w:p>
@@ -750,10 +1161,10 @@
         <w:rPr>
           <w:b/>
         </w:rPr>
-        <w:t>Recruiter Follow-up:</w:t>
+        <w:t>Grilling:</w:t>
       </w:r>
       <w:r>
-        <w:t xml:space="preserve"> *"Good. What happens if a user closes their browser while holding the Mutex lock? How do you prevent a permanent database lock?"*</w:t>
+        <w:t xml:space="preserve"> How do you prevent thread deadlocks?</w:t>
       </w:r>
     </w:p>
     <w:p>
@@ -767,10 +1178,10 @@
         <w:rPr>
           <w:b/>
         </w:rPr>
-        <w:t>Your Answer:</w:t>
+        <w:t>Answer:</w:t>
       </w:r>
       <w:r>
-        <w:t xml:space="preserve"> *"We implement a Lease Hold Timer. The Mutex is assigned a Time-To-Live (TTL) of 5 minutes. If no purchase is made within 5 minutes, a background scheduler automatically releases the lock."*</w:t>
+        <w:t xml:space="preserve"> *"A deadlock occurs when Thread A holds Lock 1 and waits for Lock 2, while Thread B holds Lock 2 and waits for Lock 1. In seat booking, we avoid deadlocks by enforcing lock ordering (seats are always locked in alphabetical/numerical order, never arbitrarily)."*</w:t>
       </w:r>
     </w:p>
     <w:p>
@@ -782,7 +1193,7 @@
           <w:b/>
           <w:color w:val="323232"/>
         </w:rPr>
-        <w:t>🎙️ Scenario B: The Recruiter Grilling on OOP Design</w:t>
+        <w:t>Q23. "Why do we override toString() in Java classes?"</w:t>
       </w:r>
     </w:p>
     <w:p>
@@ -796,10 +1207,22 @@
         <w:rPr>
           <w:b/>
         </w:rPr>
-        <w:t>Recruiter:</w:t>
+        <w:t>Answer:</w:t>
       </w:r>
       <w:r>
-        <w:t xml:space="preserve"> *"Why did you use abstract classes for password checks instead of a single long function with multiple if-else blocks?"*</w:t>
+        <w:t xml:space="preserve"> *"The default `toString()` in Java returns the class name and memory address hash. Overriding it allows us to return structured text representations (like `Card[number=4242...]`), which makes BufferedWriter serialization to log files clean and readable."*</w:t>
+      </w:r>
+    </w:p>
+    <w:p>
+      <w:pPr>
+        <w:pStyle w:val="Heading3"/>
+      </w:pPr>
+      <w:r>
+        <w:rPr>
+          <w:b/>
+          <w:color w:val="323232"/>
+        </w:rPr>
+        <w:t>Q24. "What is the difference between checked and unchecked exceptions in Java?"</w:t>
       </w:r>
     </w:p>
     <w:p>
@@ -813,22 +1236,10 @@
         <w:rPr>
           <w:b/>
         </w:rPr>
-        <w:t>Your Answer:</w:t>
+        <w:t>Checked Exception:</w:t>
       </w:r>
       <w:r>
-        <w:t xml:space="preserve"> *"Using a single function violates the Single Responsibility Principle and the Open-Closed Principle of SOLID design. If we want to add a new check tomorrow (e.g., checking if the password contains common words), we would have to modify the existing function, which risks breaking current checks. By using an Abstract Base Class, we can add new rules by simply writing new child classes without touching existing codebase files."*</w:t>
-      </w:r>
-    </w:p>
-    <w:p>
-      <w:pPr>
-        <w:pStyle w:val="Heading3"/>
-      </w:pPr>
-      <w:r>
-        <w:rPr>
-          <w:b/>
-          <w:color w:val="323232"/>
-        </w:rPr>
-        <w:t>🎙️ Scenario C: The Faculty Grilling on Luhn's Algorithm</w:t>
+        <w:t xml:space="preserve"> Exceptions checked at compile-time (e.g., `IOException` when reading files). Code *must* use try-catch or declare it with `throws`.</w:t>
       </w:r>
     </w:p>
     <w:p>
@@ -842,10 +1253,22 @@
         <w:rPr>
           <w:b/>
         </w:rPr>
-        <w:t>Faculty:</w:t>
+        <w:t>Unchecked Exception:</w:t>
       </w:r>
       <w:r>
-        <w:t xml:space="preserve"> *"If your card validation fails Luhn's check, does it crash the system? How do you handle it?"*</w:t>
+        <w:t xml:space="preserve"> Runtime exceptions (e.g., `NullPointerException`, `IllegalArgumentException`). They do not need explicit compile-time declarations. Our Luhn check throws `IllegalArgumentException` (Unchecked).</w:t>
+      </w:r>
+    </w:p>
+    <w:p>
+      <w:pPr>
+        <w:pStyle w:val="Heading3"/>
+      </w:pPr>
+      <w:r>
+        <w:rPr>
+          <w:b/>
+          <w:color w:val="323232"/>
+        </w:rPr>
+        <w:t>Q25. "Explain how the Open-Closed Principle (SOLID) is demonstrated in your Python Auditor."</w:t>
       </w:r>
     </w:p>
     <w:p>
@@ -859,10 +1282,334 @@
         <w:rPr>
           <w:b/>
         </w:rPr>
-        <w:t>Your Answer:</w:t>
+        <w:t>Answer:</w:t>
       </w:r>
       <w:r>
-        <w:t xml:space="preserve"> *"No, it does not crash. We use Java-style Exception Handling. The validator throws a custom `IllegalArgumentException` with the message 'Luhn check failed'. This exception is caught in a try-catch block, preventing system crashes and displaying a clean error message to the user."*</w:t>
+        <w:t xml:space="preserve"> *"The Open-Closed Principle states classes should be open for extension but closed for modification. Our abstract `PasswordCheck` class allows us to add new security rules (like dictionary checks) by writing new subclasses without modifying the auditor's loop logic."*</w:t>
+      </w:r>
+    </w:p>
+    <w:p>
+      <w:pPr>
+        <w:pStyle w:val="Heading3"/>
+      </w:pPr>
+      <w:r>
+        <w:rPr>
+          <w:b/>
+          <w:color w:val="323232"/>
+        </w:rPr>
+        <w:t>Q26. "What is a memory leak, and how does your React app avoid it during routing?"</w:t>
+      </w:r>
+    </w:p>
+    <w:p>
+      <w:pPr>
+        <w:pStyle w:val="ListBullet"/>
+      </w:pPr>
+      <w:r>
+        <w:t xml:space="preserve">  </w:t>
+      </w:r>
+      <w:r>
+        <w:rPr>
+          <w:b/>
+        </w:rPr>
+        <w:t>Answer:</w:t>
+      </w:r>
+      <w:r>
+        <w:t xml:space="preserve"> *"A memory leak occurs when resources (like intervals or event listeners) are not cleaned up. In our routing system, we remove global window listeners in React's cleanup hook when components unmount."*</w:t>
+      </w:r>
+    </w:p>
+    <w:p>
+      <w:pPr>
+        <w:pStyle w:val="Heading3"/>
+      </w:pPr>
+      <w:r>
+        <w:rPr>
+          <w:b/>
+          <w:color w:val="323232"/>
+        </w:rPr>
+        <w:t>Q27. "Why is local card verification preferred over server-side verification first?"</w:t>
+      </w:r>
+    </w:p>
+    <w:p>
+      <w:pPr>
+        <w:pStyle w:val="ListBullet"/>
+      </w:pPr>
+      <w:r>
+        <w:t xml:space="preserve">  </w:t>
+      </w:r>
+      <w:r>
+        <w:rPr>
+          <w:b/>
+        </w:rPr>
+        <w:t>Answer:</w:t>
+      </w:r>
+      <w:r>
+        <w:t xml:space="preserve"> *"Checking card formatting and Luhn checks locally saves network bandwidth, reduces server load, and gives immediate feedback to users, improving the user experience."*</w:t>
+      </w:r>
+    </w:p>
+    <w:p>
+      <w:pPr>
+        <w:pStyle w:val="Heading3"/>
+      </w:pPr>
+      <w:r>
+        <w:rPr>
+          <w:b/>
+          <w:color w:val="323232"/>
+        </w:rPr>
+        <w:t>Q28. "How does the Python script simulate Matplotlib exporting without a real backend?"</w:t>
+      </w:r>
+    </w:p>
+    <w:p>
+      <w:pPr>
+        <w:pStyle w:val="ListBullet"/>
+      </w:pPr>
+      <w:r>
+        <w:t xml:space="preserve">  </w:t>
+      </w:r>
+      <w:r>
+        <w:rPr>
+          <w:b/>
+        </w:rPr>
+        <w:t>Answer:</w:t>
+      </w:r>
+      <w:r>
+        <w:t xml:space="preserve"> *"We compile the audit statistics in JS and render a bar chart dynamically on an HTML5 canvas element. The `canvas.toDataURL()` method is then called to export the chart as a downloadable PNG image."*</w:t>
+      </w:r>
+    </w:p>
+    <w:p>
+      <w:pPr>
+        <w:pStyle w:val="Heading3"/>
+      </w:pPr>
+      <w:r>
+        <w:rPr>
+          <w:b/>
+          <w:color w:val="323232"/>
+        </w:rPr>
+        <w:t>Q29. "What is the difference between Abstract Classes and Interfaces in Java?"</w:t>
+      </w:r>
+    </w:p>
+    <w:p>
+      <w:pPr>
+        <w:pStyle w:val="ListBullet"/>
+      </w:pPr>
+      <w:r>
+        <w:t xml:space="preserve">  </w:t>
+      </w:r>
+      <w:r>
+        <w:rPr>
+          <w:b/>
+        </w:rPr>
+        <w:t>Abstract Class:</w:t>
+      </w:r>
+      <w:r>
+        <w:t xml:space="preserve"> Can have both abstract methods (no body) and concrete methods (with body), and can maintain instance states. A subclass can inherit from only one class.</w:t>
+      </w:r>
+    </w:p>
+    <w:p>
+      <w:pPr>
+        <w:pStyle w:val="ListBullet"/>
+      </w:pPr>
+      <w:r>
+        <w:t xml:space="preserve">  </w:t>
+      </w:r>
+      <w:r>
+        <w:rPr>
+          <w:b/>
+        </w:rPr>
+        <w:t>Interface:</w:t>
+      </w:r>
+      <w:r>
+        <w:t xml:space="preserve"> Only defines abstract signatures (until Java 8 default methods) and cannot maintain state. A class can implement multiple interfaces.</w:t>
+      </w:r>
+    </w:p>
+    <w:p>
+      <w:pPr>
+        <w:pStyle w:val="Heading3"/>
+      </w:pPr>
+      <w:r>
+        <w:rPr>
+          <w:b/>
+          <w:color w:val="323232"/>
+        </w:rPr>
+        <w:t>Q30. "What is the role of synchronized blocks in Java multithreading?"</w:t>
+      </w:r>
+    </w:p>
+    <w:p>
+      <w:pPr>
+        <w:pStyle w:val="ListBullet"/>
+      </w:pPr>
+      <w:r>
+        <w:t xml:space="preserve">  </w:t>
+      </w:r>
+      <w:r>
+        <w:rPr>
+          <w:b/>
+        </w:rPr>
+        <w:t>Answer:</w:t>
+      </w:r>
+      <w:r>
+        <w:t xml:space="preserve"> *"A synchronized block locks an object's monitor, preventing other threads from entering code sections that modify shared resources, ensuring thread safety."*</w:t>
+      </w:r>
+    </w:p>
+    <w:p>
+      <w:pPr>
+        <w:pStyle w:val="Heading3"/>
+      </w:pPr>
+      <w:r>
+        <w:rPr>
+          <w:b/>
+          <w:color w:val="323232"/>
+        </w:rPr>
+        <w:t>Q31. "How do you handle SQL injection vulnerabilities in a real booking app?"</w:t>
+      </w:r>
+    </w:p>
+    <w:p>
+      <w:pPr>
+        <w:pStyle w:val="ListBullet"/>
+      </w:pPr>
+      <w:r>
+        <w:t xml:space="preserve">  </w:t>
+      </w:r>
+      <w:r>
+        <w:rPr>
+          <w:b/>
+        </w:rPr>
+        <w:t>Answer:</w:t>
+      </w:r>
+      <w:r>
+        <w:t xml:space="preserve"> *"By using Prepared Statements or Parameterized Queries. This separates the SQL command from the user data input, preventing attackers from injecting malicious queries."*</w:t>
+      </w:r>
+    </w:p>
+    <w:p>
+      <w:pPr>
+        <w:pStyle w:val="Heading3"/>
+      </w:pPr>
+      <w:r>
+        <w:rPr>
+          <w:b/>
+          <w:color w:val="323232"/>
+        </w:rPr>
+        <w:t>Q32. "Why does our CardForm password policy default to WeakPolicy?"</w:t>
+      </w:r>
+    </w:p>
+    <w:p>
+      <w:pPr>
+        <w:pStyle w:val="ListBullet"/>
+      </w:pPr>
+      <w:r>
+        <w:t xml:space="preserve">  </w:t>
+      </w:r>
+      <w:r>
+        <w:rPr>
+          <w:b/>
+        </w:rPr>
+        <w:t>Answer:</w:t>
+      </w:r>
+      <w:r>
+        <w:t xml:space="preserve"> *"To prevent user blocks. WeakPolicy only checks length (4+ chars), allowing standard testing inputs to pass checkout smoothly, while keeping StrongPolicy toggleable for testing exception stack traces."*</w:t>
+      </w:r>
+    </w:p>
+    <w:p>
+      <w:pPr>
+        <w:pStyle w:val="Heading3"/>
+      </w:pPr>
+      <w:r>
+        <w:rPr>
+          <w:b/>
+          <w:color w:val="323232"/>
+        </w:rPr>
+        <w:t>Q33. "What are package-lock.json and package.json files?"</w:t>
+      </w:r>
+    </w:p>
+    <w:p>
+      <w:pPr>
+        <w:pStyle w:val="ListBullet"/>
+      </w:pPr>
+      <w:r>
+        <w:t xml:space="preserve">  </w:t>
+      </w:r>
+      <w:r>
+        <w:rPr>
+          <w:b/>
+        </w:rPr>
+        <w:t>package.json:</w:t>
+      </w:r>
+      <w:r>
+        <w:t xml:space="preserve"> Declares project metadata, start scripts, and high-level dependency requirements.</w:t>
+      </w:r>
+    </w:p>
+    <w:p>
+      <w:pPr>
+        <w:pStyle w:val="ListBullet"/>
+      </w:pPr>
+      <w:r>
+        <w:t xml:space="preserve">  </w:t>
+      </w:r>
+      <w:r>
+        <w:rPr>
+          <w:b/>
+        </w:rPr>
+        <w:t>package-lock.json:</w:t>
+      </w:r>
+      <w:r>
+        <w:t xml:space="preserve"> Locks the exact versions of dependencies installed, ensuring consistent builds across different machines.</w:t>
+      </w:r>
+    </w:p>
+    <w:p>
+      <w:pPr>
+        <w:pStyle w:val="Heading3"/>
+      </w:pPr>
+      <w:r>
+        <w:rPr>
+          <w:b/>
+          <w:color w:val="323232"/>
+        </w:rPr>
+        <w:t>Q34. "What is the Virtual DOM in React?"</w:t>
+      </w:r>
+    </w:p>
+    <w:p>
+      <w:pPr>
+        <w:pStyle w:val="ListBullet"/>
+      </w:pPr>
+      <w:r>
+        <w:t xml:space="preserve">  </w:t>
+      </w:r>
+      <w:r>
+        <w:rPr>
+          <w:b/>
+        </w:rPr>
+        <w:t>Answer:</w:t>
+      </w:r>
+      <w:r>
+        <w:t xml:space="preserve"> *"An in-memory representation of the real DOM. When state changes, React updates the Virtual DOM first, runs a diffing algorithm, and patches only the changed elements in the real browser DOM, saving performance."*</w:t>
+      </w:r>
+    </w:p>
+    <w:p>
+      <w:pPr>
+        <w:pStyle w:val="Heading3"/>
+      </w:pPr>
+      <w:r>
+        <w:rPr>
+          <w:b/>
+          <w:color w:val="323232"/>
+        </w:rPr>
+        <w:t>Q35. "Explain how you would deploy this CineBook application to production."</w:t>
+      </w:r>
+    </w:p>
+    <w:p>
+      <w:pPr>
+        <w:pStyle w:val="ListBullet"/>
+      </w:pPr>
+      <w:r>
+        <w:t xml:space="preserve">  </w:t>
+      </w:r>
+      <w:r>
+        <w:rPr>
+          <w:b/>
+        </w:rPr>
+        <w:t>Answer:</w:t>
+      </w:r>
+      <w:r>
+        <w:t xml:space="preserve"> *"I would bundle the React SPA into static HTML/CSS/JS files using build compilers (like Webpack or Vite), host the frontend on a CDN (like Vercel or AWS S3), and deploy the Java and Python backend components as API microservices using Docker containers."*</w:t>
       </w:r>
     </w:p>
     <w:sectPr>

</xml_diff>